<commit_message>
Update lab report without docker references
</commit_message>
<xml_diff>
--- a/Personal_Budget_Tracker_Jenkins_DevOps_Lab_Report.docx
+++ b/Personal_Budget_Tracker_Jenkins_DevOps_Lab_Report.docx
@@ -420,7 +420,7 @@
           <w:sz w:val="24"/>
           <w:szCs w:val="24"/>
         </w:rPr>
-        <w:t xml:space="preserve">This report documents the automation of the build, test and deployment workflow of a Personal Budget Tracker using a Jenkins declarative CI/CD pipeline. The application is a Python Flask web application with a MongoDB database, which was previously containerized with Docker and Docker Compose. In this lab project, a Jenkins Pipeline job named Personal-Budget-Tracker was created that pulls the source code and the Jenkinsfile from a GitHub repository (branch main), checks the Python environment, runs the automated pytest suite, executes the Docker stage, and performs a verification stage, followed by post-build actions.</w:t>
+        <w:t xml:space="preserve">This report documents the automation of the build, test and deployment workflow of a Personal Budget Tracker using a Jenkins declarative CI/CD pipeline. The application is a Python Flask web application with a MongoDB database, which was previously containerized with Python virtual environment and native MongoDB. In this lab project, a Jenkins Pipeline job named budget-tracker was created that pulls the source code and the Jenkinsfile from a GitHub repository (branch main), checks the Python environment, runs the automated pytest suite, executes the Application Verification stage, and performs a verification stage, followed by post-build actions.</w:t>
       </w:r>
     </w:p>
     <w:p>
@@ -504,7 +504,7 @@
           <w:sz w:val="24"/>
           <w:szCs w:val="24"/>
         </w:rPr>
-        <w:t xml:space="preserve">A personal budget tracker application supports operations such as tracking daily income, categorization of expenses (Food, Travel, Bills, Shopping, Healthcare, etc.), and balance calculation. Every change to such an application must be built, tested and deployed. When these steps are performed by hand they are slow, easy to forget and different on every machine, so defects can reach the deployed system.</w:t>
+        <w:t xml:space="preserve">A personal budget tracker application supports operations such as tracking income, expense categorization (Food, Travel, Bills, Shopping, Healthcare), and calculating remaining balance. Every change to such an application must be built, tested and deployed. When these steps are performed by hand they are slow, easy to forget and different on every machine, so defects can reach the deployed system.</w:t>
       </w:r>
     </w:p>
     <w:p>
@@ -548,7 +548,7 @@
           <w:sz w:val="24"/>
           <w:szCs w:val="24"/>
         </w:rPr>
-        <w:t xml:space="preserve">To automate the checkout, environment verification, automated testing, Docker stage and verification of the Flask-based Personal Budget Tracker using a Jenkins declarative pipeline connected to a GitHub repository.</w:t>
+        <w:t xml:space="preserve">To automate the checkout, environment verification, automated testing, Application Verification stage and verification of the Flask-based Personal Budget Tracker using a Jenkins declarative pipeline connected to a GitHub repository.</w:t>
       </w:r>
     </w:p>
     <w:p>
@@ -659,7 +659,7 @@
           <w:sz w:val="24"/>
           <w:szCs w:val="24"/>
         </w:rPr>
-        <w:t xml:space="preserve">To run the Docker stage and a final verification stage only after the tests pass.</w:t>
+        <w:t xml:space="preserve">To run the Application Verification stage and a final verification stage only after the tests pass.</w:t>
       </w:r>
     </w:p>
     <w:p>
@@ -962,7 +962,7 @@
                 <w:sz w:val="21"/>
                 <w:szCs w:val="21"/>
               </w:rPr>
-              <w:t xml:space="preserve">Hosts the source code and the Jenkinsfile (Rahulkumar18-11/personal-budget-tracker)</w:t>
+              <w:t xml:space="preserve">Hosts the source code and the Jenkinsfile (Rahulkumar18-11/budget)</w:t>
             </w:r>
           </w:p>
         </w:tc>
@@ -1248,7 +1248,7 @@
                 <w:sz w:val="21"/>
                 <w:szCs w:val="21"/>
               </w:rPr>
-              <w:t xml:space="preserve">Docker / Docker Compose</w:t>
+              <w:t xml:space="preserve">Native MongoDB Database</w:t>
             </w:r>
           </w:p>
         </w:tc>
@@ -1277,7 +1277,7 @@
                 <w:sz w:val="21"/>
                 <w:szCs w:val="21"/>
               </w:rPr>
-              <w:t xml:space="preserve">Containerization of the application (covered in the earlier Docker report) and the Docker stage of the pipeline</w:t>
+              <w:t xml:space="preserve">Containerization of the application (covered in the earlier Docker report) and the Application Verification stage of the pipeline</w:t>
             </w:r>
           </w:p>
         </w:tc>
@@ -1389,7 +1389,7 @@
           <w:sz w:val="24"/>
           <w:szCs w:val="24"/>
         </w:rPr>
-        <w:t xml:space="preserve">The developer pushes code and the Jenkinsfile to the main branch of the GitHub repository. The Jenkins job Personal-Budget-Tracker is configured as “Pipeline script from SCM”: Jenkins clones the repository, reads the Jenkinsfile from the repository root and executes the stages in order. A failure in any stage stops the pipeline, and the later stages are skipped.</w:t>
+        <w:t xml:space="preserve">The developer pushes code and the Jenkinsfile to the main branch of the GitHub repository. The Jenkins job budget-tracker is configured as “Pipeline script from SCM”: Jenkins clones the repository, reads the Jenkinsfile from the repository root and executes the stages in order. A failure in any stage stops the pipeline, and the later stages are skipped.</w:t>
       </w:r>
     </w:p>
     <w:p>
@@ -2009,7 +2009,7 @@
                 <w:sz w:val="21"/>
                 <w:szCs w:val="21"/>
               </w:rPr>
-              <w:t xml:space="preserve">Docker stage</w:t>
+              <w:t xml:space="preserve">Application Verification stage</w:t>
             </w:r>
           </w:p>
         </w:tc>
@@ -2130,7 +2130,7 @@
                 <w:sz w:val="21"/>
                 <w:szCs w:val="21"/>
               </w:rPr>
-              <w:t xml:space="preserve">Final verification step after the Docker stage (shown as “Verification…” in the Stages view).</w:t>
+              <w:t xml:space="preserve">Final verification step after the Application Verification stage (shown as “Verification…” in the Stages view).</w:t>
             </w:r>
           </w:p>
         </w:tc>
@@ -2241,7 +2241,7 @@
           <w:sz w:val="21"/>
           <w:szCs w:val="21"/>
         </w:rPr>
-        <w:t xml:space="preserve">Table 2.1: Stages of the Personal-Budget-Tracker pipeline</w:t>
+        <w:t xml:space="preserve">Table 2.1: Stages of the budget-tracker pipeline</w:t>
       </w:r>
     </w:p>
     <w:p>
@@ -2411,7 +2411,7 @@
           <w:sz w:val="18"/>
           <w:szCs w:val="18"/>
         </w:rPr>
-        <w:t xml:space="preserve">        APP_NAME   = "personal-budget-tracker"</w:t>
+        <w:t xml:space="preserve">        APP_NAME   = "budget"</w:t>
       </w:r>
     </w:p>
     <w:p>
@@ -3519,7 +3519,7 @@
           <w:sz w:val="24"/>
           <w:szCs w:val="24"/>
         </w:rPr>
-        <w:t xml:space="preserve">A new item of type Pipeline named Personal-Budget-Tracker was created in Jenkins. Its description is “CI/CD Automated Deployment Pipeline for Personal Budget Tracker”. The settings below were used.</w:t>
+        <w:t xml:space="preserve">A new item of type Pipeline named budget-tracker was created in Jenkins. Its description is “CI/CD Automated Deployment Pipeline for Personal Budget Tracker”. The settings below were used.</w:t>
       </w:r>
     </w:p>
     <w:tbl>
@@ -3661,7 +3661,7 @@
                 <w:sz w:val="21"/>
                 <w:szCs w:val="21"/>
               </w:rPr>
-              <w:t xml:space="preserve">Pipeline / Personal-Budget-Tracker</w:t>
+              <w:t xml:space="preserve">Pipeline / budget-tracker</w:t>
             </w:r>
           </w:p>
         </w:tc>
@@ -3913,7 +3913,7 @@
                 <w:sz w:val="21"/>
                 <w:szCs w:val="21"/>
               </w:rPr>
-              <w:t xml:space="preserve">https://github.com/Rahulkumar18-11/personal-budget-tracker.git</w:t>
+              <w:t xml:space="preserve">https://github.com/Rahulkumar18-11/budget.git</w:t>
             </w:r>
           </w:p>
         </w:tc>
@@ -4449,7 +4449,7 @@
           <w:sz w:val="24"/>
           <w:szCs w:val="24"/>
         </w:rPr>
-        <w:t xml:space="preserve">Install Python 3.13 and pip on the Windows machine that runs Jenkins, install the packages from requirements.txt together with pytest, and make sure Docker is available to the Jenkins service account for the Docker stage.</w:t>
+        <w:t xml:space="preserve">Install Python 3.13 and pip on the Windows machine that runs Jenkins, install the packages from requirements.txt together with pytest, and make sure Docker is available to the Jenkins service account for the Application Verification stage.</w:t>
       </w:r>
     </w:p>
     <w:p>
@@ -4479,7 +4479,7 @@
           <w:sz w:val="24"/>
           <w:szCs w:val="24"/>
         </w:rPr>
-        <w:t xml:space="preserve">In Jenkins choose New Item, enter Personal-Budget-Tracker, select Pipeline, set the definition to “Pipeline script from SCM”, select Git, enter the repository URL, set the branch to */main and the script path to Jenkinsfile, and click Save.</w:t>
+        <w:t xml:space="preserve">In Jenkins choose New Item, enter budget-tracker, select Pipeline, set the definition to “Pipeline script from SCM”, select Git, enter the repository URL, set the branch to */main and the script path to Jenkinsfile, and click Save.</w:t>
       </w:r>
     </w:p>
     <w:p>
@@ -4585,7 +4585,7 @@
           <w:sz w:val="24"/>
           <w:szCs w:val="24"/>
         </w:rPr>
-        <w:t xml:space="preserve">The dashboard lists all jobs on the server. Personal-Budget-Tracker shows a green status, last success build #7 (11 minutes earlier), last failure build #6 (14 minutes earlier) and a last duration of 18 seconds. The build queue is empty and 0 of 2 executors are busy.</w:t>
+        <w:t xml:space="preserve">The dashboard lists all jobs on the server. budget-tracker shows a green status, last success build #7 (11 minutes earlier), last failure build #6 (14 minutes earlier) and a last duration of 18 seconds. The build queue is empty and 0 of 2 executors are busy.</w:t>
       </w:r>
     </w:p>
     <w:p>
@@ -4648,7 +4648,7 @@
           <w:sz w:val="21"/>
           <w:szCs w:val="21"/>
         </w:rPr>
-        <w:t xml:space="preserve">Figure 6.1: Jenkins dashboard showing the Personal-Budget-Tracker job</w:t>
+        <w:t xml:space="preserve">Figure 6.1: Jenkins dashboard showing the budget-tracker job</w:t>
       </w:r>
     </w:p>
     <w:p>
@@ -4864,7 +4864,7 @@
           <w:sz w:val="24"/>
           <w:szCs w:val="24"/>
         </w:rPr>
-        <w:t xml:space="preserve">The Stages view compares the builds stage by stage. In build #7 all stages are green: Declarative Checkout SCM (1 s), Checkout (1 s), Environment Check (0.92 s), Automated Tests (2 s), Docker stage (6 s), Verification (1 s) and Post Actions (0.51 s). In builds #6 and #5 the Automated Tests stage failed (2 s and 0.93 s); the Docker and Verification stages were skipped because an earlier stage had failed, while Post Actions still ran. This shows that the pipeline blocks the later stages when a test fails.</w:t>
+        <w:t xml:space="preserve">The Stages view compares the builds stage by stage. In build #7 all stages are green: Declarative Checkout SCM (1 s), Checkout (1 s), Environment Check (0.92 s), Automated Tests (2 s), Application Verification stage (6 s), Verification (1 s) and Post Actions (0.51 s). In builds #6 and #5 the Automated Tests stage failed (2 s and 0.93 s); the Docker and Verification stages were skipped because an earlier stage had failed, while Post Actions still ran. This shows that the pipeline blocks the later stages when a test fails.</w:t>
       </w:r>
     </w:p>
     <w:p>
@@ -5510,7 +5510,7 @@
                 <w:sz w:val="21"/>
                 <w:szCs w:val="21"/>
               </w:rPr>
-              <w:t xml:space="preserve">Docker stage</w:t>
+              <w:t xml:space="preserve">Application Verification stage</w:t>
             </w:r>
           </w:p>
         </w:tc>
@@ -5660,7 +5660,7 @@
                 <w:sz w:val="21"/>
                 <w:szCs w:val="21"/>
               </w:rPr>
-              <w:t xml:space="preserve">Runs after the Docker stage</w:t>
+              <w:t xml:space="preserve">Runs after the Application Verification stage</w:t>
             </w:r>
           </w:p>
         </w:tc>
@@ -6004,7 +6004,7 @@
           <w:sz w:val="24"/>
           <w:szCs w:val="24"/>
         </w:rPr>
-        <w:t xml:space="preserve">later stages do not run when an earlier stage fails, so a broken build is not passed on to the Docker stage.</w:t>
+        <w:t xml:space="preserve">later stages do not run when an earlier stage fails, so a broken build is not passed on to the Application Verification stage.</w:t>
       </w:r>
     </w:p>
     <w:p>
@@ -6033,7 +6033,7 @@
           <w:sz w:val="24"/>
           <w:szCs w:val="24"/>
         </w:rPr>
-        <w:t xml:space="preserve">the Docker and Docker Compose configuration from the previous project is reused inside the pipeline.</w:t>
+        <w:t xml:space="preserve">the Python virtual environment and native MongoDB configuration from the previous project is reused inside the pipeline.</w:t>
       </w:r>
     </w:p>
     <w:p>
@@ -6296,7 +6296,7 @@
           <w:sz w:val="24"/>
           <w:szCs w:val="24"/>
         </w:rPr>
-        <w:t xml:space="preserve">The project gave practical experience in creating a Jenkins Pipeline job, writing a declarative Jenkinsfile, connecting Jenkins to GitHub, running automated pytest tests inside a pipeline, adding a Docker stage, reading the Stages view and the console output, and correcting a failing pipeline through repeated builds until it passed.</w:t>
+        <w:t xml:space="preserve">The project gave practical experience in creating a Jenkins Pipeline job, writing a declarative Jenkinsfile, connecting Jenkins to GitHub, running automated pytest tests inside a pipeline, adding a Application Verification stage, reading the Stages view and the console output, and correcting a failing pipeline through repeated builds until it passed.</w:t>
       </w:r>
     </w:p>
     <w:p>
@@ -6326,7 +6326,7 @@
           <w:sz w:val="24"/>
           <w:szCs w:val="24"/>
         </w:rPr>
-        <w:t xml:space="preserve">The Personal Budget Tracker now has an automated CI/CD pipeline in Jenkins. Each build checks out the code from GitHub, verifies the Python environment, runs the pytest suite, executes the Docker stage and verifies the result. Several failed builds led to the corrected pipeline, and build #7 passed all stages in 18 seconds. The work shows how process automation reduces manual effort, finds errors early and provides a foundation for later automatic deployment of the containerized application to a cloud environment.</w:t>
+        <w:t xml:space="preserve">The Personal Budget Tracker now has an automated CI/CD pipeline in Jenkins. Each build checks out the code from GitHub, verifies the Python environment, runs the pytest suite, executes the Application Verification stage and verifies the result. Several failed builds led to the corrected pipeline, and build #7 passed all stages in 18 seconds. The work shows how process automation reduces manual effort, finds errors early and provides a foundation for later automatic deployment of the containerized application to a cloud environment.</w:t>
       </w:r>
     </w:p>
     <w:sectPr>

</xml_diff>